<commit_message>
Migrar las salas de la versión anterior en lugar de borrarlas
El panel del profesor trataba las salas sin expire_at (creadas antes del
cambio de cumplimiento) como caducadas y las eliminaba al entrar. Ahora se
migran: reciben el plazo de 60 días y un PIN alfanumérico nuevo, quedan
cerradas, y sus recursos y archivos pasan de las colecciones globales
resources/fileChunks a rooms/{id}/resources. Las reglas permiten esa
migración una sola vez y solo al profesor dueño.

Co-Authored-By: Claude Opus 5.5 <noreply@anthropic.com>
Claude-Session: https://claude.ai/code/session_013MfhYGkUZMh9J4xud3rfPD
</commit_message>
<xml_diff>
--- a/colaborafp/docs/Cumplimiento_ColaboraFP.docx
+++ b/colaborafp/docs/Cumplimiento_ColaboraFP.docx
@@ -1250,7 +1250,7 @@
               <w:rPr>
                 <w:b/>
               </w:rPr>
-              <w:t>Borrar los datos de la versión anterior</w:t>
+              <w:t>Retirar los datos de la versión anterior</w:t>
             </w:r>
           </w:p>
         </w:tc>
@@ -1271,7 +1271,7 @@
             </w:pPr>
             <w:r>
               <w:rPr/>
-              <w:t xml:space="preserve">Firestore → Datos: eliminar las colecciones antiguas de nivel superior </w:t>
+              <w:t xml:space="preserve">Las salas antiguas se migran solas (plazo de 60 días y PIN nuevo) cuando su profesor entra en el panel. Pasados unos días, cuando todo el profesorado haya entrado, eliminar lo que quede en las colecciones antiguas </w:t>
             </w:r>
             <w:r>
               <w:rPr>
@@ -1291,7 +1291,7 @@
             </w:r>
             <w:r>
               <w:rPr/>
-              <w:t>. Las nuevas reglas ya impiden acceder a ellas.</w:t>
+              <w:t>. Solo el profesor dueño puede leerlas.</w:t>
             </w:r>
           </w:p>
         </w:tc>

</xml_diff>

<commit_message>
Plazo de borrado elegido por el profesor y script de recuperación de salas
- Al crear la sala se elige cuándo se borra (1 semana, 1 mes, 60 días,
  3 meses, fin de curso, 1 año o una fecha concreta) y se puede cambiar
  después desde el panel; la nueva fecha se aplica al PIN, recursos,
  archivos y notificaciones. Máximo 1 año, comprobado en las reglas.
- Los recursos nuevos del alumnado siguen la fecha vigente en directo.
- scripts/recuperar-salas.mjs: recrea en Cloud Shell las fichas de sala
  borradas por el fallo anterior a partir del contenido antiguo.
- Textos legales, README y documento de cumplimiento actualizados.

Co-Authored-By: Claude Opus 5.5 <noreply@anthropic.com>
Claude-Session: https://claude.ai/code/session_013MfhYGkUZMh9J4xud3rfPD
</commit_message>
<xml_diff>
--- a/colaborafp/docs/Cumplimiento_ColaboraFP.docx
+++ b/colaborafp/docs/Cumplimiento_ColaboraFP.docx
@@ -53,15 +53,15 @@
         </w:tblCellMar>
       </w:tblPr>
       <w:tblGrid>
-        <w:gridCol w:w="1680"/>
-        <w:gridCol w:w="1989"/>
-        <w:gridCol w:w="6536"/>
+        <w:gridCol w:w="1630"/>
+        <w:gridCol w:w="1938"/>
+        <w:gridCol w:w="6637"/>
       </w:tblGrid>
       <w:tr>
         <w:trPr/>
         <w:tc>
           <w:tcPr>
-            <w:tcW w:w="1680" w:type="dxa"/>
+            <w:tcW w:w="1630" w:type="dxa"/>
             <w:tcBorders/>
             <w:vAlign w:val="center"/>
           </w:tcPr>
@@ -81,7 +81,7 @@
         </w:tc>
         <w:tc>
           <w:tcPr>
-            <w:tcW w:w="1989" w:type="dxa"/>
+            <w:tcW w:w="1938" w:type="dxa"/>
             <w:tcBorders/>
             <w:vAlign w:val="center"/>
           </w:tcPr>
@@ -102,7 +102,7 @@
         </w:tc>
         <w:tc>
           <w:tcPr>
-            <w:tcW w:w="6536" w:type="dxa"/>
+            <w:tcW w:w="6637" w:type="dxa"/>
             <w:tcBorders/>
             <w:vAlign w:val="center"/>
           </w:tcPr>
@@ -126,7 +126,7 @@
         <w:trPr/>
         <w:tc>
           <w:tcPr>
-            <w:tcW w:w="1680" w:type="dxa"/>
+            <w:tcW w:w="1630" w:type="dxa"/>
             <w:tcBorders/>
             <w:vAlign w:val="center"/>
           </w:tcPr>
@@ -146,7 +146,7 @@
         </w:tc>
         <w:tc>
           <w:tcPr>
-            <w:tcW w:w="1989" w:type="dxa"/>
+            <w:tcW w:w="1938" w:type="dxa"/>
             <w:tcBorders/>
             <w:shd w:fill="FDF5C4" w:val="clear"/>
             <w:vAlign w:val="center"/>
@@ -172,31 +172,31 @@
         </w:tc>
         <w:tc>
           <w:tcPr>
-            <w:tcW w:w="6536" w:type="dxa"/>
-            <w:tcBorders/>
-            <w:vAlign w:val="center"/>
-          </w:tcPr>
-          <w:p>
-            <w:pPr>
-              <w:pStyle w:val="TableContents"/>
-              <w:widowControl w:val="false"/>
-              <w:suppressLineNumbers/>
-              <w:bidi w:val="0"/>
-              <w:jc w:val="left"/>
-              <w:rPr/>
-            </w:pPr>
-            <w:r>
-              <w:rPr/>
-              <w:t>Política de privacidad (art. 13 RGPD); información básica en el punto de recogida; plazos de borrado automáticos (cierre a las 12 h, borrado a los 60 días); derecho de supresión desde el panel; datos en la UE; tipografías autoalojadas sin transferencias a Google Fonts; sin cookies ni analítica. Pendiente: aceptar los contratos de encargo de Google y Netlify, inscribir el tratamiento en el RAT y activar el TTL.</w:t>
-            </w:r>
-          </w:p>
-        </w:tc>
-      </w:tr>
-      <w:tr>
-        <w:trPr/>
-        <w:tc>
-          <w:tcPr>
-            <w:tcW w:w="1680" w:type="dxa"/>
+            <w:tcW w:w="6637" w:type="dxa"/>
+            <w:tcBorders/>
+            <w:vAlign w:val="center"/>
+          </w:tcPr>
+          <w:p>
+            <w:pPr>
+              <w:pStyle w:val="TableContents"/>
+              <w:widowControl w:val="false"/>
+              <w:suppressLineNumbers/>
+              <w:bidi w:val="0"/>
+              <w:jc w:val="left"/>
+              <w:rPr/>
+            </w:pPr>
+            <w:r>
+              <w:rPr/>
+              <w:t>Política de privacidad (art. 13 RGPD); información básica en el punto de recogida; plazos de borrado automáticos (cierre a las 12 h; borrado en la fecha que fija el profesor, 60 días por defecto y 1 año como máximo); derecho de supresión desde el panel; datos en la UE; tipografías autoalojadas sin transferencias a Google Fonts; sin cookies ni analítica. Pendiente: aceptar los contratos de encargo de Google y Netlify, inscribir el tratamiento en el RAT y activar el TTL.</w:t>
+            </w:r>
+          </w:p>
+        </w:tc>
+      </w:tr>
+      <w:tr>
+        <w:trPr/>
+        <w:tc>
+          <w:tcPr>
+            <w:tcW w:w="1630" w:type="dxa"/>
             <w:tcBorders/>
             <w:vAlign w:val="center"/>
           </w:tcPr>
@@ -216,7 +216,7 @@
         </w:tc>
         <w:tc>
           <w:tcPr>
-            <w:tcW w:w="1989" w:type="dxa"/>
+            <w:tcW w:w="1938" w:type="dxa"/>
             <w:tcBorders/>
             <w:shd w:fill="FDF5C4" w:val="clear"/>
             <w:vAlign w:val="center"/>
@@ -242,7 +242,7 @@
         </w:tc>
         <w:tc>
           <w:tcPr>
-            <w:tcW w:w="6536" w:type="dxa"/>
+            <w:tcW w:w="6637" w:type="dxa"/>
             <w:tcBorders/>
             <w:vAlign w:val="center"/>
           </w:tcPr>
@@ -276,7 +276,7 @@
         <w:trPr/>
         <w:tc>
           <w:tcPr>
-            <w:tcW w:w="1680" w:type="dxa"/>
+            <w:tcW w:w="1630" w:type="dxa"/>
             <w:tcBorders/>
             <w:vAlign w:val="center"/>
           </w:tcPr>
@@ -296,7 +296,7 @@
         </w:tc>
         <w:tc>
           <w:tcPr>
-            <w:tcW w:w="1989" w:type="dxa"/>
+            <w:tcW w:w="1938" w:type="dxa"/>
             <w:tcBorders/>
             <w:shd w:fill="E3EFE9" w:val="clear"/>
             <w:vAlign w:val="center"/>
@@ -322,7 +322,7 @@
         </w:tc>
         <w:tc>
           <w:tcPr>
-            <w:tcW w:w="6536" w:type="dxa"/>
+            <w:tcW w:w="6637" w:type="dxa"/>
             <w:tcBorders/>
             <w:vAlign w:val="center"/>
           </w:tcPr>
@@ -346,7 +346,7 @@
         <w:trPr/>
         <w:tc>
           <w:tcPr>
-            <w:tcW w:w="1680" w:type="dxa"/>
+            <w:tcW w:w="1630" w:type="dxa"/>
             <w:tcBorders/>
             <w:vAlign w:val="center"/>
           </w:tcPr>
@@ -366,7 +366,7 @@
         </w:tc>
         <w:tc>
           <w:tcPr>
-            <w:tcW w:w="1989" w:type="dxa"/>
+            <w:tcW w:w="1938" w:type="dxa"/>
             <w:tcBorders/>
             <w:shd w:fill="E3EFE9" w:val="clear"/>
             <w:vAlign w:val="center"/>
@@ -392,7 +392,7 @@
         </w:tc>
         <w:tc>
           <w:tcPr>
-            <w:tcW w:w="6536" w:type="dxa"/>
+            <w:tcW w:w="6637" w:type="dxa"/>
             <w:tcBorders/>
             <w:vAlign w:val="center"/>
           </w:tcPr>
@@ -416,7 +416,7 @@
         <w:trPr/>
         <w:tc>
           <w:tcPr>
-            <w:tcW w:w="1680" w:type="dxa"/>
+            <w:tcW w:w="1630" w:type="dxa"/>
             <w:tcBorders/>
             <w:vAlign w:val="center"/>
           </w:tcPr>
@@ -436,7 +436,7 @@
         </w:tc>
         <w:tc>
           <w:tcPr>
-            <w:tcW w:w="1989" w:type="dxa"/>
+            <w:tcW w:w="1938" w:type="dxa"/>
             <w:tcBorders/>
             <w:shd w:fill="E3EFE9" w:val="clear"/>
             <w:vAlign w:val="center"/>
@@ -462,7 +462,7 @@
         </w:tc>
         <w:tc>
           <w:tcPr>
-            <w:tcW w:w="6536" w:type="dxa"/>
+            <w:tcW w:w="6637" w:type="dxa"/>
             <w:tcBorders/>
             <w:vAlign w:val="center"/>
           </w:tcPr>
@@ -486,7 +486,7 @@
         <w:trPr/>
         <w:tc>
           <w:tcPr>
-            <w:tcW w:w="1680" w:type="dxa"/>
+            <w:tcW w:w="1630" w:type="dxa"/>
             <w:tcBorders/>
             <w:vAlign w:val="center"/>
           </w:tcPr>
@@ -506,7 +506,7 @@
         </w:tc>
         <w:tc>
           <w:tcPr>
-            <w:tcW w:w="1989" w:type="dxa"/>
+            <w:tcW w:w="1938" w:type="dxa"/>
             <w:tcBorders/>
             <w:shd w:fill="EEEEEE" w:val="clear"/>
             <w:vAlign w:val="center"/>
@@ -530,7 +530,7 @@
         </w:tc>
         <w:tc>
           <w:tcPr>
-            <w:tcW w:w="6536" w:type="dxa"/>
+            <w:tcW w:w="6637" w:type="dxa"/>
             <w:tcBorders/>
             <w:vAlign w:val="center"/>
           </w:tcPr>
@@ -1271,7 +1271,7 @@
             </w:pPr>
             <w:r>
               <w:rPr/>
-              <w:t xml:space="preserve">Las salas antiguas se migran solas (plazo de 60 días y PIN nuevo) cuando su profesor entra en el panel. Pasados unos días, cuando todo el profesorado haya entrado, eliminar lo que quede en las colecciones antiguas </w:t>
+              <w:t xml:space="preserve">Las salas antiguas se migran solas (plazo de 60 días, modificable, y PIN nuevo) cuando su profesor entra en el panel. Pasados unos días, cuando todo el profesorado haya entrado, eliminar lo que quede en las colecciones antiguas </w:t>
             </w:r>
             <w:r>
               <w:rPr>
@@ -1951,7 +1951,7 @@
             </w:pPr>
             <w:r>
               <w:rPr/>
-              <w:t>Salas cerradas automáticamente a las 12 h; sala y todo su contenido borrados a los 60 días de su creación; cuenta del profesorado mientras preste servicio o hasta que la elimine.</w:t>
+              <w:t>Salas cerradas automáticamente a las 12 h; sala y todo su contenido borrados en la fecha que fija el profesor (60 días por defecto, como máximo 1 año); cuenta del profesorado mientras preste servicio o hasta que la elimine.</w:t>
             </w:r>
           </w:p>
         </w:tc>
@@ -2023,7 +2023,7 @@
       </w:pPr>
       <w:r>
         <w:rPr/>
-        <w:t xml:space="preserve">Según la lista de tratamientos de la AEPD que requieren EIPD, solo concurre un criterio: datos de personas vulnerables (alumnado que puede ser menor de edad). No hay datos de categorías especiales, ni elaboración de perfiles o decisiones automatizadas, ni tratamiento a gran escala, ni observación sistemática, ni uso de tecnologías innovadoras. Además, el alumnado no se identifica (alias opcional) y los datos se borran a los 60 días. Con un solo criterio, </w:t>
+        <w:t xml:space="preserve">Según la lista de tratamientos de la AEPD que requieren EIPD, solo concurre un criterio: datos de personas vulnerables (alumnado que puede ser menor de edad). No hay datos de categorías especiales, ni elaboración de perfiles o decisiones automatizadas, ni tratamiento a gran escala, ni observación sistemática, ni uso de tecnologías innovadoras. Además, el alumnado no se identifica (alias opcional) y los datos se borran en un plazo breve (60 días por defecto, 1 año como máximo). Con un solo criterio, </w:t>
       </w:r>
       <w:r>
         <w:rPr>

</xml_diff>

<commit_message>
Privacidad: ubicación real de Firebase Authentication, correo y copias de sala
- Firebase Authentication (Google LLC) figura en EE. UU., no en la UE; Firestore sigue en la UE.
- Se añaden como encargados la función de correo de Netlify y el proveedor de correo del centro.
- Se explican las copias de sala (.colaborafp) y quién responde de ellas.
- Documento de cumplimiento: ficha del registro de actividades corregida.

Co-Authored-By: Claude Opus 5.5 <noreply@anthropic.com>
Claude-Session: https://claude.ai/code/session_019isaL5XvWxVMVs69W1yrxR
</commit_message>
<xml_diff>
--- a/colaborafp/docs/Cumplimiento_ColaboraFP.docx
+++ b/colaborafp/docs/Cumplimiento_ColaboraFP.docx
@@ -24,7 +24,7 @@
       </w:pPr>
       <w:r>
         <w:rPr/>
-        <w:t>ColaboraFP · Centro de Formación Profesional José Ramón Otero · Versión de 15 de octubre de 2026</w:t>
+        <w:t>ColaboraFP · Centro de Formación Profesional José Ramón Otero · Versión de 19 de octubre de 2026</w:t>
       </w:r>
     </w:p>
     <w:p>
@@ -1861,7 +1861,7 @@
             </w:pPr>
             <w:r>
               <w:rPr/>
-              <w:t>Google Ireland Ltd. (Firebase Authentication y Cloud Firestore, UE); Netlify, Inc. (alojamiento web, EE. UU.). Sin cesiones a terceros.</w:t>
+              <w:t>Google Ireland Ltd. (Cloud Firestore, UE); Google LLC (Firebase Authentication, EE. UU.); Netlify, Inc. (alojamiento web y función de correo, EE. UU.); proveedor de correo del centro (Microsoft 365 o Resend). Sin cesiones a terceros.</w:t>
             </w:r>
           </w:p>
         </w:tc>
@@ -1906,7 +1906,7 @@
             </w:pPr>
             <w:r>
               <w:rPr/>
-              <w:t>Netlify, Inc. (EE. UU.): Marco de Privacidad de Datos UE-EE. UU. y/o cláusulas contractuales tipo (arts. 45-46 RGPD).</w:t>
+              <w:t>Google LLC (Firebase Authentication) y Netlify, Inc., en EE. UU.: Marco de Privacidad de Datos UE-EE. UU. y cláusulas contractuales tipo (arts. 45-46 RGPD); proveedor de correo, según su contrato. Las copias de sala que descarga el profesor quedan bajo su responsabilidad en el almacenamiento del centro.</w:t>
             </w:r>
           </w:p>
         </w:tc>

</xml_diff>